<commit_message>
Fix ajout StatusPath introuvable
</commit_message>
<xml_diff>
--- a/res/adhesion_files/bulletin_adhesion_bluegenji.docx
+++ b/res/adhesion_files/bulletin_adhesion_bluegenji.docx
@@ -1,6 +1,6 @@
 
 <file path=word/document.xml><?xml version="1.0" encoding="utf-8"?>
-<w:document xmlns:mc="http://schemas.openxmlformats.org/markup-compatibility/2006" xmlns:o="urn:schemas-microsoft-com:office:office" xmlns:r="http://schemas.openxmlformats.org/officeDocument/2006/relationships" xmlns:m="http://schemas.openxmlformats.org/officeDocument/2006/math" xmlns:v="urn:schemas-microsoft-com:vml" xmlns:wp="http://schemas.openxmlformats.org/drawingml/2006/wordprocessingDrawing" xmlns:w10="urn:schemas-microsoft-com:office:word" xmlns:w="http://schemas.openxmlformats.org/wordprocessingml/2006/main" xmlns:wne="http://schemas.microsoft.com/office/word/2006/wordml" xmlns:sl="http://schemas.openxmlformats.org/schemaLibrary/2006/main" xmlns:a="http://schemas.openxmlformats.org/drawingml/2006/main" xmlns:pic="http://schemas.openxmlformats.org/drawingml/2006/picture" xmlns:c="http://schemas.openxmlformats.org/drawingml/2006/chart" xmlns:lc="http://schemas.openxmlformats.org/drawingml/2006/lockedCanvas" xmlns:dgm="http://schemas.openxmlformats.org/drawingml/2006/diagram" xmlns:wps="http://schemas.microsoft.com/office/word/2010/wordprocessingShape" xmlns:wpg="http://schemas.microsoft.com/office/word/2010/wordprocessingGroup" xmlns:w14="http://schemas.microsoft.com/office/word/2010/wordml" xmlns:w15="http://schemas.microsoft.com/office/word/2012/wordml" xmlns:w16="http://schemas.microsoft.com/office/word/2018/wordml" xmlns:w16cex="http://schemas.microsoft.com/office/word/2018/wordml/cex" xmlns:w16cid="http://schemas.microsoft.com/office/word/2016/wordml/cid" xmlns:cr="http://schemas.microsoft.com/office/comments/2020/reactions">
+<w:document xmlns:mc="http://schemas.openxmlformats.org/markup-compatibility/2006" xmlns:o="urn:schemas-microsoft-com:office:office" xmlns:r="http://schemas.openxmlformats.org/officeDocument/2006/relationships" xmlns:m="http://schemas.openxmlformats.org/officeDocument/2006/math" xmlns:v="urn:schemas-microsoft-com:vml" xmlns:wp="http://schemas.openxmlformats.org/drawingml/2006/wordprocessingDrawing" xmlns:w10="urn:schemas-microsoft-com:office:word" xmlns:w="http://schemas.openxmlformats.org/wordprocessingml/2006/main" xmlns:wne="http://schemas.microsoft.com/office/word/2006/wordml" xmlns:sl="http://schemas.openxmlformats.org/schemaLibrary/2006/main" xmlns:a="http://schemas.openxmlformats.org/drawingml/2006/main" xmlns:pic="http://schemas.openxmlformats.org/drawingml/2006/picture" xmlns:c="http://schemas.openxmlformats.org/drawingml/2006/chart" xmlns:lc="http://schemas.openxmlformats.org/drawingml/2006/lockedCanvas" xmlns:dgm="http://schemas.openxmlformats.org/drawingml/2006/diagram" xmlns:wps="http://schemas.microsoft.com/office/word/2010/wordprocessingShape" xmlns:wpg="http://schemas.microsoft.com/office/word/2010/wordprocessingGroup" xmlns:w14="http://schemas.microsoft.com/office/word/2010/wordml" xmlns:w15="http://schemas.microsoft.com/office/word/2012/wordml" xmlns:w16="http://schemas.microsoft.com/office/word/2018/wordml" xmlns:w16cex="http://schemas.microsoft.com/office/word/2018/wordml/cex" xmlns:w16cid="http://schemas.microsoft.com/office/word/2016/wordml/cid" xmlns="http://schemas.microsoft.com/office/tasks/2019/documenttasks" xmlns:cr="http://schemas.microsoft.com/office/comments/2020/reactions">
   <w:body>
     <w:p>
       <w:pPr>
@@ -8,6 +8,7 @@
         <w:rPr>
           <w:rFonts w:ascii="Arial" w:cs="Arial" w:eastAsia="Arial" w:hAnsi="Arial"/>
           <w:b w:val="0"/>
+          <w:bCs w:val="0"/>
           <w:sz w:val="28"/>
           <w:szCs w:val="28"/>
           <w:vertAlign w:val="baseline"/>
@@ -17,6 +18,7 @@
         <w:rPr>
           <w:rFonts w:ascii="Arial" w:cs="Arial" w:eastAsia="Arial" w:hAnsi="Arial"/>
           <w:b w:val="1"/>
+          <w:bCs w:val="1"/>
           <w:sz w:val="28"/>
           <w:szCs w:val="28"/>
           <w:vertAlign w:val="baseline"/>
@@ -28,6 +30,7 @@
         <w:rPr>
           <w:rFonts w:ascii="Arial" w:cs="Arial" w:eastAsia="Arial" w:hAnsi="Arial"/>
           <w:b w:val="1"/>
+          <w:bCs w:val="1"/>
           <w:sz w:val="28"/>
           <w:szCs w:val="28"/>
           <w:rtl w:val="0"/>
@@ -38,6 +41,7 @@
         <w:rPr>
           <w:rFonts w:ascii="Arial" w:cs="Arial" w:eastAsia="Arial" w:hAnsi="Arial"/>
           <w:b w:val="1"/>
+          <w:bCs w:val="1"/>
           <w:sz w:val="28"/>
           <w:szCs w:val="28"/>
           <w:vertAlign w:val="baseline"/>
@@ -49,6 +53,7 @@
         <w:rPr>
           <w:rFonts w:ascii="Arial" w:cs="Arial" w:eastAsia="Arial" w:hAnsi="Arial"/>
           <w:b w:val="1"/>
+          <w:bCs w:val="1"/>
           <w:sz w:val="28"/>
           <w:szCs w:val="28"/>
           <w:rtl w:val="0"/>
@@ -66,6 +71,7 @@
         <w:rPr>
           <w:rFonts w:ascii="Arial" w:cs="Arial" w:eastAsia="Arial" w:hAnsi="Arial"/>
           <w:b w:val="0"/>
+          <w:bCs w:val="0"/>
           <w:vertAlign w:val="baseline"/>
         </w:rPr>
       </w:pPr>
@@ -80,6 +86,7 @@
         <w:rPr>
           <w:rFonts w:ascii="Arial" w:cs="Arial" w:eastAsia="Arial" w:hAnsi="Arial"/>
           <w:b w:val="0"/>
+          <w:bCs w:val="0"/>
           <w:vertAlign w:val="baseline"/>
         </w:rPr>
       </w:pPr>
@@ -94,6 +101,7 @@
         <w:rPr>
           <w:rFonts w:ascii="Arial" w:cs="Arial" w:eastAsia="Arial" w:hAnsi="Arial"/>
           <w:b w:val="0"/>
+          <w:bCs w:val="0"/>
           <w:vertAlign w:val="baseline"/>
         </w:rPr>
       </w:pPr>
@@ -101,6 +109,7 @@
         <w:rPr>
           <w:rFonts w:ascii="Arial" w:cs="Arial" w:eastAsia="Arial" w:hAnsi="Arial"/>
           <w:b w:val="1"/>
+          <w:bCs w:val="1"/>
           <w:vertAlign w:val="baseline"/>
           <w:rtl w:val="0"/>
         </w:rPr>
@@ -110,6 +119,7 @@
         <w:rPr>
           <w:rFonts w:ascii="Arial" w:cs="Arial" w:eastAsia="Arial" w:hAnsi="Arial"/>
           <w:b w:val="1"/>
+          <w:bCs w:val="1"/>
           <w:rtl w:val="0"/>
         </w:rPr>
         <w:t xml:space="preserve">À</w:t>
@@ -118,6 +128,7 @@
         <w:rPr>
           <w:rFonts w:ascii="Arial" w:cs="Arial" w:eastAsia="Arial" w:hAnsi="Arial"/>
           <w:b w:val="1"/>
+          <w:bCs w:val="1"/>
           <w:vertAlign w:val="baseline"/>
           <w:rtl w:val="0"/>
         </w:rPr>
@@ -227,7 +238,36 @@
           <w:rFonts w:ascii="Arial" w:cs="Arial" w:eastAsia="Arial" w:hAnsi="Arial"/>
           <w:rtl w:val="0"/>
         </w:rPr>
-        <w:t xml:space="preserve"> pour le rôle de membre _ _ _ _ _ _.</w:t>
+        <w:t xml:space="preserve"> pour le rôle de membre </w:t>
+      </w:r>
+      <w:sdt>
+        <w:sdtPr>
+          <w:alias w:val="Membre"/>
+          <w:id w:val="-338675991"/>
+          <w:dropDownList w:lastValue="--Type de membre--">
+            <w:listItem w:displayText="--Type de membre--" w:value="--Type de membre--"/>
+            <w:listItem w:displayText="ordinaire" w:value="ordinaire"/>
+            <w:listItem w:displayText="bienfaiteur" w:value="bienfaiteur"/>
+            <w:listItem w:displayText="d'honneur" w:value="d'honneur"/>
+          </w:dropDownList>
+        </w:sdtPr>
+        <w:sdtContent>
+          <w:r>
+            <w:rPr>
+              <w:rFonts w:ascii="Arial" w:cs="Arial" w:eastAsia="Arial" w:hAnsi="Arial"/>
+              <w:color w:val="000000"/>
+              <w:shd w:fill="e8eaed" w:val="clear"/>
+            </w:rPr>
+            <w:t xml:space="preserve">--Type de membre--</w:t>
+          </w:r>
+        </w:sdtContent>
+      </w:sdt>
+      <w:r>
+        <w:rPr>
+          <w:rFonts w:ascii="Arial" w:cs="Arial" w:eastAsia="Arial" w:hAnsi="Arial"/>
+          <w:rtl w:val="0"/>
+        </w:rPr>
+        <w:t xml:space="preserve">.</w:t>
       </w:r>
       <w:r>
         <w:rPr>
@@ -257,31 +297,29 @@
         <w:jc w:val="both"/>
         <w:rPr>
           <w:rFonts w:ascii="Arial" w:cs="Arial" w:eastAsia="Arial" w:hAnsi="Arial"/>
-          <w:vertAlign w:val="baseline"/>
-        </w:rPr>
-      </w:pPr>
-      <w:r>
-        <w:rPr>
-          <w:rFonts w:ascii="Arial" w:cs="Arial" w:eastAsia="Arial" w:hAnsi="Arial"/>
-          <w:vertAlign w:val="baseline"/>
-          <w:rtl w:val="0"/>
-        </w:rPr>
-        <w:t xml:space="preserve">Je déclare avoir été également informé des dispositions de la loi du 6 janvier 1978 qui </w:t>
-      </w:r>
-      <w:r>
-        <w:rPr>
-          <w:rFonts w:ascii="Arial" w:cs="Arial" w:eastAsia="Arial" w:hAnsi="Arial"/>
-          <w:rtl w:val="0"/>
-        </w:rPr>
-        <w:t xml:space="preserve">réglemente</w:t>
-      </w:r>
-      <w:r>
-        <w:rPr>
-          <w:rFonts w:ascii="Arial" w:cs="Arial" w:eastAsia="Arial" w:hAnsi="Arial"/>
-          <w:vertAlign w:val="baseline"/>
-          <w:rtl w:val="0"/>
-        </w:rPr>
-        <w:t xml:space="preserve"> le droit de communication dans le fichier des membres de l’association des données personnelles me concernant. </w:t>
+        </w:rPr>
+      </w:pPr>
+      <w:r>
+        <w:rPr>
+          <w:rFonts w:ascii="Arial" w:cs="Arial" w:eastAsia="Arial" w:hAnsi="Arial"/>
+          <w:rtl w:val="0"/>
+        </w:rPr>
+        <w:t xml:space="preserve">Les informations recueillies sont nécessaires à la gestion de l’adhésion.</w:t>
+      </w:r>
+    </w:p>
+    <w:p>
+      <w:pPr>
+        <w:jc w:val="both"/>
+        <w:rPr>
+          <w:rFonts w:ascii="Arial" w:cs="Arial" w:eastAsia="Arial" w:hAnsi="Arial"/>
+        </w:rPr>
+      </w:pPr>
+      <w:r>
+        <w:rPr>
+          <w:rFonts w:ascii="Arial" w:cs="Arial" w:eastAsia="Arial" w:hAnsi="Arial"/>
+          <w:rtl w:val="0"/>
+        </w:rPr>
+        <w:t xml:space="preserve">Elles sont destinées exclusivement à l’association Bluegenji Esport et ne seront pas cédées à des tiers.</w:t>
       </w:r>
     </w:p>
     <w:p>
@@ -304,22 +342,22 @@
           <w:rFonts w:ascii="Arial" w:cs="Arial" w:eastAsia="Arial" w:hAnsi="Arial"/>
           <w:rtl w:val="0"/>
         </w:rPr>
-        <w:t xml:space="preserve">par virement PayPal. (Indiquer 0€ dans le cas d’une adhésion ordinaire ou d’honneur)</w:t>
-      </w:r>
-    </w:p>
-    <w:p>
-      <w:pPr>
-        <w:jc w:val="both"/>
-        <w:rPr>
-          <w:rFonts w:ascii="Arial" w:cs="Arial" w:eastAsia="Arial" w:hAnsi="Arial"/>
-        </w:rPr>
-      </w:pPr>
-      <w:r>
-        <w:rPr>
-          <w:rFonts w:ascii="Arial" w:cs="Arial" w:eastAsia="Arial" w:hAnsi="Arial"/>
-          <w:rtl w:val="0"/>
-        </w:rPr>
-        <w:t xml:space="preserve">(Facultatif) Tag Discord : _ _ _ _ _ _.</w:t>
+        <w:t xml:space="preserve">par PayPal. (Indiquer 0€ dans le cas d’une adhésion ordinaire ou d’honneur)</w:t>
+      </w:r>
+    </w:p>
+    <w:p>
+      <w:pPr>
+        <w:jc w:val="both"/>
+        <w:rPr>
+          <w:rFonts w:ascii="Arial" w:cs="Arial" w:eastAsia="Arial" w:hAnsi="Arial"/>
+        </w:rPr>
+      </w:pPr>
+      <w:r>
+        <w:rPr>
+          <w:rFonts w:ascii="Arial" w:cs="Arial" w:eastAsia="Arial" w:hAnsi="Arial"/>
+          <w:rtl w:val="0"/>
+        </w:rPr>
+        <w:t xml:space="preserve">(Facultatif mais recommandé) Tag Discord : _ _ _ _ _ _.</w:t>
       </w:r>
     </w:p>
     <w:p>
@@ -461,6 +499,7 @@
         <w:rPr>
           <w:rFonts w:ascii="Arial" w:cs="Arial" w:eastAsia="Arial" w:hAnsi="Arial"/>
           <w:b w:val="0"/>
+          <w:bCs w:val="0"/>
           <w:vertAlign w:val="baseline"/>
         </w:rPr>
       </w:pPr>
@@ -468,6 +507,7 @@
         <w:rPr>
           <w:rFonts w:ascii="Arial" w:cs="Arial" w:eastAsia="Arial" w:hAnsi="Arial"/>
           <w:b w:val="1"/>
+          <w:bCs w:val="1"/>
           <w:vertAlign w:val="baseline"/>
           <w:rtl w:val="0"/>
         </w:rPr>
@@ -711,12 +751,11 @@
 </file>
 
 <file path=word/footer1.xml><?xml version="1.0" encoding="utf-8"?>
-<w:ftr xmlns:mc="http://schemas.openxmlformats.org/markup-compatibility/2006" xmlns:o="urn:schemas-microsoft-com:office:office" xmlns:r="http://schemas.openxmlformats.org/officeDocument/2006/relationships" xmlns:m="http://schemas.openxmlformats.org/officeDocument/2006/math" xmlns:v="urn:schemas-microsoft-com:vml" xmlns:wp="http://schemas.openxmlformats.org/drawingml/2006/wordprocessingDrawing" xmlns:w10="urn:schemas-microsoft-com:office:word" xmlns:w="http://schemas.openxmlformats.org/wordprocessingml/2006/main" xmlns:wne="http://schemas.microsoft.com/office/word/2006/wordml" xmlns:sl="http://schemas.openxmlformats.org/schemaLibrary/2006/main" xmlns:a="http://schemas.openxmlformats.org/drawingml/2006/main" xmlns:pic="http://schemas.openxmlformats.org/drawingml/2006/picture" xmlns:c="http://schemas.openxmlformats.org/drawingml/2006/chart" xmlns:lc="http://schemas.openxmlformats.org/drawingml/2006/lockedCanvas" xmlns:dgm="http://schemas.openxmlformats.org/drawingml/2006/diagram" xmlns:wps="http://schemas.microsoft.com/office/word/2010/wordprocessingShape" xmlns:wpg="http://schemas.microsoft.com/office/word/2010/wordprocessingGroup" xmlns:w14="http://schemas.microsoft.com/office/word/2010/wordml" xmlns:w15="http://schemas.microsoft.com/office/word/2012/wordml" xmlns:w16="http://schemas.microsoft.com/office/word/2018/wordml" xmlns:w16cex="http://schemas.microsoft.com/office/word/2018/wordml/cex" xmlns:w16cid="http://schemas.microsoft.com/office/word/2016/wordml/cid" xmlns:cr="http://schemas.microsoft.com/office/comments/2020/reactions">
+<w:ftr xmlns:mc="http://schemas.openxmlformats.org/markup-compatibility/2006" xmlns:o="urn:schemas-microsoft-com:office:office" xmlns:r="http://schemas.openxmlformats.org/officeDocument/2006/relationships" xmlns:m="http://schemas.openxmlformats.org/officeDocument/2006/math" xmlns:v="urn:schemas-microsoft-com:vml" xmlns:wp="http://schemas.openxmlformats.org/drawingml/2006/wordprocessingDrawing" xmlns:w10="urn:schemas-microsoft-com:office:word" xmlns:w="http://schemas.openxmlformats.org/wordprocessingml/2006/main" xmlns:wne="http://schemas.microsoft.com/office/word/2006/wordml" xmlns:sl="http://schemas.openxmlformats.org/schemaLibrary/2006/main" xmlns:a="http://schemas.openxmlformats.org/drawingml/2006/main" xmlns:pic="http://schemas.openxmlformats.org/drawingml/2006/picture" xmlns:c="http://schemas.openxmlformats.org/drawingml/2006/chart" xmlns:lc="http://schemas.openxmlformats.org/drawingml/2006/lockedCanvas" xmlns:dgm="http://schemas.openxmlformats.org/drawingml/2006/diagram" xmlns:wps="http://schemas.microsoft.com/office/word/2010/wordprocessingShape" xmlns:wpg="http://schemas.microsoft.com/office/word/2010/wordprocessingGroup" xmlns:w14="http://schemas.microsoft.com/office/word/2010/wordml" xmlns:w15="http://schemas.microsoft.com/office/word/2012/wordml" xmlns:w16="http://schemas.microsoft.com/office/word/2018/wordml" xmlns:w16cex="http://schemas.microsoft.com/office/word/2018/wordml/cex" xmlns:w16cid="http://schemas.microsoft.com/office/word/2016/wordml/cid" xmlns="http://schemas.microsoft.com/office/tasks/2019/documenttasks" xmlns:cr="http://schemas.microsoft.com/office/comments/2020/reactions">
   <w:p>
     <w:pPr>
       <w:keepNext w:val="0"/>
       <w:keepLines w:val="0"/>
-      <w:pageBreakBefore w:val="0"/>
       <w:widowControl w:val="1"/>
       <w:pBdr>
         <w:top w:space="0" w:sz="0" w:val="nil"/>
@@ -736,7 +775,9 @@
       <w:rPr>
         <w:rFonts w:ascii="Times New Roman" w:cs="Times New Roman" w:eastAsia="Times New Roman" w:hAnsi="Times New Roman"/>
         <w:b w:val="0"/>
+        <w:bCs w:val="0"/>
         <w:i w:val="0"/>
+        <w:iCs w:val="0"/>
         <w:smallCaps w:val="0"/>
         <w:strike w:val="0"/>
         <w:color w:val="0000ff"/>
@@ -751,7 +792,9 @@
       <w:rPr>
         <w:rFonts w:ascii="Times New Roman" w:cs="Times New Roman" w:eastAsia="Times New Roman" w:hAnsi="Times New Roman"/>
         <w:b w:val="0"/>
+        <w:bCs w:val="0"/>
         <w:i w:val="0"/>
+        <w:iCs w:val="0"/>
         <w:smallCaps w:val="0"/>
         <w:strike w:val="0"/>
         <w:color w:val="0000ff"/>
@@ -783,7 +826,6 @@
     <w:pPr>
       <w:keepNext w:val="0"/>
       <w:keepLines w:val="0"/>
-      <w:pageBreakBefore w:val="0"/>
       <w:widowControl w:val="1"/>
       <w:pBdr>
         <w:top w:space="0" w:sz="0" w:val="nil"/>
@@ -803,7 +845,9 @@
       <w:rPr>
         <w:rFonts w:ascii="Times New Roman" w:cs="Times New Roman" w:eastAsia="Times New Roman" w:hAnsi="Times New Roman"/>
         <w:b w:val="0"/>
+        <w:bCs w:val="0"/>
         <w:i w:val="0"/>
+        <w:iCs w:val="0"/>
         <w:smallCaps w:val="0"/>
         <w:strike w:val="0"/>
         <w:color w:val="0000ff"/>
@@ -818,7 +862,9 @@
       <w:rPr>
         <w:rFonts w:ascii="Times New Roman" w:cs="Times New Roman" w:eastAsia="Times New Roman" w:hAnsi="Times New Roman"/>
         <w:b w:val="0"/>
+        <w:bCs w:val="0"/>
         <w:i w:val="0"/>
+        <w:iCs w:val="0"/>
         <w:smallCaps w:val="0"/>
         <w:strike w:val="0"/>
         <w:color w:val="0000ff"/>
@@ -838,7 +884,7 @@
         <w:szCs w:val="20"/>
         <w:rtl w:val="0"/>
       </w:rPr>
-      <w:t xml:space="preserve">78 avenue Général leclerc</w:t>
+      <w:t xml:space="preserve">4 impasse des cyprès</w:t>
     </w:r>
     <w:r>
       <w:rPr>
@@ -850,7 +896,6 @@
     <w:pPr>
       <w:keepNext w:val="0"/>
       <w:keepLines w:val="0"/>
-      <w:pageBreakBefore w:val="0"/>
       <w:widowControl w:val="1"/>
       <w:pBdr>
         <w:top w:space="0" w:sz="0" w:val="nil"/>
@@ -870,7 +915,9 @@
       <w:rPr>
         <w:rFonts w:ascii="Times New Roman" w:cs="Times New Roman" w:eastAsia="Times New Roman" w:hAnsi="Times New Roman"/>
         <w:b w:val="0"/>
+        <w:bCs w:val="0"/>
         <w:i w:val="0"/>
+        <w:iCs w:val="0"/>
         <w:smallCaps w:val="0"/>
         <w:strike w:val="0"/>
         <w:color w:val="0000ff"/>
@@ -885,7 +932,9 @@
       <w:rPr>
         <w:rFonts w:ascii="Times New Roman" w:cs="Times New Roman" w:eastAsia="Times New Roman" w:hAnsi="Times New Roman"/>
         <w:b w:val="0"/>
+        <w:bCs w:val="0"/>
         <w:i w:val="0"/>
+        <w:iCs w:val="0"/>
         <w:smallCaps w:val="0"/>
         <w:strike w:val="0"/>
         <w:color w:val="0000ff"/>
@@ -905,7 +954,7 @@
         <w:szCs w:val="20"/>
         <w:rtl w:val="0"/>
       </w:rPr>
-      <w:t xml:space="preserve">72000 LE MANS</w:t>
+      <w:t xml:space="preserve">51210 JANVILLIERS</w:t>
     </w:r>
     <w:r>
       <w:rPr>
@@ -917,12 +966,11 @@
 </file>
 
 <file path=word/header1.xml><?xml version="1.0" encoding="utf-8"?>
-<w:hdr xmlns:mc="http://schemas.openxmlformats.org/markup-compatibility/2006" xmlns:o="urn:schemas-microsoft-com:office:office" xmlns:r="http://schemas.openxmlformats.org/officeDocument/2006/relationships" xmlns:m="http://schemas.openxmlformats.org/officeDocument/2006/math" xmlns:v="urn:schemas-microsoft-com:vml" xmlns:wp="http://schemas.openxmlformats.org/drawingml/2006/wordprocessingDrawing" xmlns:w10="urn:schemas-microsoft-com:office:word" xmlns:w="http://schemas.openxmlformats.org/wordprocessingml/2006/main" xmlns:wne="http://schemas.microsoft.com/office/word/2006/wordml" xmlns:sl="http://schemas.openxmlformats.org/schemaLibrary/2006/main" xmlns:a="http://schemas.openxmlformats.org/drawingml/2006/main" xmlns:pic="http://schemas.openxmlformats.org/drawingml/2006/picture" xmlns:c="http://schemas.openxmlformats.org/drawingml/2006/chart" xmlns:lc="http://schemas.openxmlformats.org/drawingml/2006/lockedCanvas" xmlns:dgm="http://schemas.openxmlformats.org/drawingml/2006/diagram" xmlns:wps="http://schemas.microsoft.com/office/word/2010/wordprocessingShape" xmlns:wpg="http://schemas.microsoft.com/office/word/2010/wordprocessingGroup" xmlns:w14="http://schemas.microsoft.com/office/word/2010/wordml" xmlns:w15="http://schemas.microsoft.com/office/word/2012/wordml" xmlns:w16="http://schemas.microsoft.com/office/word/2018/wordml" xmlns:w16cex="http://schemas.microsoft.com/office/word/2018/wordml/cex" xmlns:w16cid="http://schemas.microsoft.com/office/word/2016/wordml/cid" xmlns:cr="http://schemas.microsoft.com/office/comments/2020/reactions">
+<w:hdr xmlns:mc="http://schemas.openxmlformats.org/markup-compatibility/2006" xmlns:o="urn:schemas-microsoft-com:office:office" xmlns:r="http://schemas.openxmlformats.org/officeDocument/2006/relationships" xmlns:m="http://schemas.openxmlformats.org/officeDocument/2006/math" xmlns:v="urn:schemas-microsoft-com:vml" xmlns:wp="http://schemas.openxmlformats.org/drawingml/2006/wordprocessingDrawing" xmlns:w10="urn:schemas-microsoft-com:office:word" xmlns:w="http://schemas.openxmlformats.org/wordprocessingml/2006/main" xmlns:wne="http://schemas.microsoft.com/office/word/2006/wordml" xmlns:sl="http://schemas.openxmlformats.org/schemaLibrary/2006/main" xmlns:a="http://schemas.openxmlformats.org/drawingml/2006/main" xmlns:pic="http://schemas.openxmlformats.org/drawingml/2006/picture" xmlns:c="http://schemas.openxmlformats.org/drawingml/2006/chart" xmlns:lc="http://schemas.openxmlformats.org/drawingml/2006/lockedCanvas" xmlns:dgm="http://schemas.openxmlformats.org/drawingml/2006/diagram" xmlns:wps="http://schemas.microsoft.com/office/word/2010/wordprocessingShape" xmlns:wpg="http://schemas.microsoft.com/office/word/2010/wordprocessingGroup" xmlns:w14="http://schemas.microsoft.com/office/word/2010/wordml" xmlns:w15="http://schemas.microsoft.com/office/word/2012/wordml" xmlns:w16="http://schemas.microsoft.com/office/word/2018/wordml" xmlns:w16cex="http://schemas.microsoft.com/office/word/2018/wordml/cex" xmlns:w16cid="http://schemas.microsoft.com/office/word/2016/wordml/cid" xmlns="http://schemas.microsoft.com/office/tasks/2019/documenttasks" xmlns:cr="http://schemas.microsoft.com/office/comments/2020/reactions">
   <w:p>
     <w:pPr>
       <w:keepNext w:val="0"/>
       <w:keepLines w:val="0"/>
-      <w:pageBreakBefore w:val="0"/>
       <w:widowControl w:val="1"/>
       <w:pBdr>
         <w:top w:space="0" w:sz="0" w:val="nil"/>
@@ -942,7 +990,9 @@
       <w:rPr>
         <w:rFonts w:ascii="Times New Roman" w:cs="Times New Roman" w:eastAsia="Times New Roman" w:hAnsi="Times New Roman"/>
         <w:b w:val="0"/>
+        <w:bCs w:val="0"/>
         <w:i w:val="0"/>
+        <w:iCs w:val="0"/>
         <w:smallCaps w:val="0"/>
         <w:strike w:val="0"/>
         <w:color w:val="000000"/>
@@ -959,7 +1009,7 @@
         <wp:inline distB="114300" distT="114300" distL="114300" distR="114300">
           <wp:extent cx="2639850" cy="1484459"/>
           <wp:effectExtent b="0" l="0" r="0" t="0"/>
-          <wp:docPr id="1026" name="image1.png"/>
+          <wp:docPr id="1028" name="image1.png"/>
           <a:graphic>
             <a:graphicData uri="http://schemas.openxmlformats.org/drawingml/2006/picture">
               <pic:pic>
@@ -998,28 +1048,36 @@
 </file>
 
 <file path=word/numbering.xml><?xml version="1.0" encoding="utf-8"?>
-<w:numbering xmlns:mc="http://schemas.openxmlformats.org/markup-compatibility/2006" xmlns:o="urn:schemas-microsoft-com:office:office" xmlns:r="http://schemas.openxmlformats.org/officeDocument/2006/relationships" xmlns:m="http://schemas.openxmlformats.org/officeDocument/2006/math" xmlns:v="urn:schemas-microsoft-com:vml" xmlns:wp="http://schemas.openxmlformats.org/drawingml/2006/wordprocessingDrawing" xmlns:w10="urn:schemas-microsoft-com:office:word" xmlns:w="http://schemas.openxmlformats.org/wordprocessingml/2006/main" xmlns:wne="http://schemas.microsoft.com/office/word/2006/wordml" xmlns:sl="http://schemas.openxmlformats.org/schemaLibrary/2006/main" xmlns:a="http://schemas.openxmlformats.org/drawingml/2006/main" xmlns:pic="http://schemas.openxmlformats.org/drawingml/2006/picture" xmlns:c="http://schemas.openxmlformats.org/drawingml/2006/chart" xmlns:lc="http://schemas.openxmlformats.org/drawingml/2006/lockedCanvas" xmlns:dgm="http://schemas.openxmlformats.org/drawingml/2006/diagram" xmlns:wps="http://schemas.microsoft.com/office/word/2010/wordprocessingShape" xmlns:wpg="http://schemas.microsoft.com/office/word/2010/wordprocessingGroup" xmlns:w14="http://schemas.microsoft.com/office/word/2010/wordml" xmlns:w15="http://schemas.microsoft.com/office/word/2012/wordml" xmlns:w16="http://schemas.microsoft.com/office/word/2018/wordml" xmlns:w16cex="http://schemas.microsoft.com/office/word/2018/wordml/cex" xmlns:w16cid="http://schemas.microsoft.com/office/word/2016/wordml/cid" xmlns:cr="http://schemas.microsoft.com/office/comments/2020/reactions"/>
+<w:numbering xmlns:mc="http://schemas.openxmlformats.org/markup-compatibility/2006" xmlns:o="urn:schemas-microsoft-com:office:office" xmlns:r="http://schemas.openxmlformats.org/officeDocument/2006/relationships" xmlns:m="http://schemas.openxmlformats.org/officeDocument/2006/math" xmlns:v="urn:schemas-microsoft-com:vml" xmlns:wp="http://schemas.openxmlformats.org/drawingml/2006/wordprocessingDrawing" xmlns:w10="urn:schemas-microsoft-com:office:word" xmlns:w="http://schemas.openxmlformats.org/wordprocessingml/2006/main" xmlns:wne="http://schemas.microsoft.com/office/word/2006/wordml" xmlns:sl="http://schemas.openxmlformats.org/schemaLibrary/2006/main" xmlns:a="http://schemas.openxmlformats.org/drawingml/2006/main" xmlns:pic="http://schemas.openxmlformats.org/drawingml/2006/picture" xmlns:c="http://schemas.openxmlformats.org/drawingml/2006/chart" xmlns:lc="http://schemas.openxmlformats.org/drawingml/2006/lockedCanvas" xmlns:dgm="http://schemas.openxmlformats.org/drawingml/2006/diagram" xmlns:wps="http://schemas.microsoft.com/office/word/2010/wordprocessingShape" xmlns:wpg="http://schemas.microsoft.com/office/word/2010/wordprocessingGroup" xmlns:w14="http://schemas.microsoft.com/office/word/2010/wordml" xmlns:w15="http://schemas.microsoft.com/office/word/2012/wordml" xmlns:w16="http://schemas.microsoft.com/office/word/2018/wordml" xmlns:w16cex="http://schemas.microsoft.com/office/word/2018/wordml/cex" xmlns:w16cid="http://schemas.microsoft.com/office/word/2016/wordml/cid" xmlns="http://schemas.microsoft.com/office/tasks/2019/documenttasks" xmlns:cr="http://schemas.microsoft.com/office/comments/2020/reactions"/>
 </file>
 
 <file path=word/styles.xml><?xml version="1.0" encoding="utf-8"?>
-<w:styles xmlns:mc="http://schemas.openxmlformats.org/markup-compatibility/2006" xmlns:o="urn:schemas-microsoft-com:office:office" xmlns:r="http://schemas.openxmlformats.org/officeDocument/2006/relationships" xmlns:m="http://schemas.openxmlformats.org/officeDocument/2006/math" xmlns:v="urn:schemas-microsoft-com:vml" xmlns:wp="http://schemas.openxmlformats.org/drawingml/2006/wordprocessingDrawing" xmlns:w10="urn:schemas-microsoft-com:office:word" xmlns:w="http://schemas.openxmlformats.org/wordprocessingml/2006/main" xmlns:wne="http://schemas.microsoft.com/office/word/2006/wordml" xmlns:sl="http://schemas.openxmlformats.org/schemaLibrary/2006/main" xmlns:a="http://schemas.openxmlformats.org/drawingml/2006/main" xmlns:pic="http://schemas.openxmlformats.org/drawingml/2006/picture" xmlns:c="http://schemas.openxmlformats.org/drawingml/2006/chart" xmlns:lc="http://schemas.openxmlformats.org/drawingml/2006/lockedCanvas" xmlns:dgm="http://schemas.openxmlformats.org/drawingml/2006/diagram" xmlns:wps="http://schemas.microsoft.com/office/word/2010/wordprocessingShape" xmlns:wpg="http://schemas.microsoft.com/office/word/2010/wordprocessingGroup" xmlns:w14="http://schemas.microsoft.com/office/word/2010/wordml" xmlns:w15="http://schemas.microsoft.com/office/word/2012/wordml" xmlns:w16="http://schemas.microsoft.com/office/word/2018/wordml" xmlns:w16cex="http://schemas.microsoft.com/office/word/2018/wordml/cex" xmlns:w16cid="http://schemas.microsoft.com/office/word/2016/wordml/cid" xmlns:cr="http://schemas.microsoft.com/office/comments/2020/reactions">
+<w:styles xmlns:mc="http://schemas.openxmlformats.org/markup-compatibility/2006" xmlns:o="urn:schemas-microsoft-com:office:office" xmlns:r="http://schemas.openxmlformats.org/officeDocument/2006/relationships" xmlns:m="http://schemas.openxmlformats.org/officeDocument/2006/math" xmlns:v="urn:schemas-microsoft-com:vml" xmlns:wp="http://schemas.openxmlformats.org/drawingml/2006/wordprocessingDrawing" xmlns:w10="urn:schemas-microsoft-com:office:word" xmlns:w="http://schemas.openxmlformats.org/wordprocessingml/2006/main" xmlns:wne="http://schemas.microsoft.com/office/word/2006/wordml" xmlns:sl="http://schemas.openxmlformats.org/schemaLibrary/2006/main" xmlns:a="http://schemas.openxmlformats.org/drawingml/2006/main" xmlns:pic="http://schemas.openxmlformats.org/drawingml/2006/picture" xmlns:c="http://schemas.openxmlformats.org/drawingml/2006/chart" xmlns:lc="http://schemas.openxmlformats.org/drawingml/2006/lockedCanvas" xmlns:dgm="http://schemas.openxmlformats.org/drawingml/2006/diagram" xmlns:wps="http://schemas.microsoft.com/office/word/2010/wordprocessingShape" xmlns:wpg="http://schemas.microsoft.com/office/word/2010/wordprocessingGroup" xmlns:w14="http://schemas.microsoft.com/office/word/2010/wordml" xmlns:w15="http://schemas.microsoft.com/office/word/2012/wordml" xmlns:w16="http://schemas.microsoft.com/office/word/2018/wordml" xmlns:w16cex="http://schemas.microsoft.com/office/word/2018/wordml/cex" xmlns:w16cid="http://schemas.microsoft.com/office/word/2016/wordml/cid" xmlns="http://schemas.microsoft.com/office/tasks/2019/documenttasks" xmlns:cr="http://schemas.microsoft.com/office/comments/2020/reactions">
   <w:docDefaults>
     <w:rPrDefault>
       <w:rPr>
         <w:sz w:val="24"/>
         <w:szCs w:val="24"/>
-        <w:lang w:val="fr-FR"/>
+        <w:lang w:val="fr"/>
       </w:rPr>
     </w:rPrDefault>
     <w:pPrDefault>
       <w:pPr/>
     </w:pPrDefault>
   </w:docDefaults>
+  <w:style w:type="table" w:styleId="TableNormal" w:default="1">
+    <w:name w:val="TableNormal"/>
+    <w:tblPr>
+      <w:tblCellMar>
+        <w:top w:w="100.0" w:type="dxa"/>
+        <w:left w:w="100.0" w:type="dxa"/>
+        <w:bottom w:w="100.0" w:type="dxa"/>
+        <w:right w:w="100.0" w:type="dxa"/>
+      </w:tblCellMar>
+    </w:tblPr>
+  </w:style>
   <w:style w:type="paragraph" w:styleId="Normal" w:default="1">
     <w:name w:val="normal"/>
-  </w:style>
-  <w:style w:type="table" w:styleId="TableNormal" w:default="1">
-    <w:name w:val="Table Normal"/>
   </w:style>
   <w:style w:type="paragraph" w:styleId="Heading1">
     <w:name w:val="heading 1"/>
@@ -1033,6 +1091,7 @@
     </w:pPr>
     <w:rPr>
       <w:b w:val="1"/>
+      <w:bCs w:val="1"/>
       <w:sz w:val="48"/>
       <w:szCs w:val="48"/>
     </w:rPr>
@@ -1049,6 +1108,7 @@
     </w:pPr>
     <w:rPr>
       <w:b w:val="1"/>
+      <w:bCs w:val="1"/>
       <w:sz w:val="36"/>
       <w:szCs w:val="36"/>
     </w:rPr>
@@ -1065,6 +1125,7 @@
     </w:pPr>
     <w:rPr>
       <w:b w:val="1"/>
+      <w:bCs w:val="1"/>
       <w:sz w:val="28"/>
       <w:szCs w:val="28"/>
     </w:rPr>
@@ -1081,6 +1142,7 @@
     </w:pPr>
     <w:rPr>
       <w:b w:val="1"/>
+      <w:bCs w:val="1"/>
       <w:sz w:val="24"/>
       <w:szCs w:val="24"/>
     </w:rPr>
@@ -1097,6 +1159,7 @@
     </w:pPr>
     <w:rPr>
       <w:b w:val="1"/>
+      <w:bCs w:val="1"/>
       <w:sz w:val="22"/>
       <w:szCs w:val="22"/>
     </w:rPr>
@@ -1113,6 +1176,7 @@
     </w:pPr>
     <w:rPr>
       <w:b w:val="1"/>
+      <w:bCs w:val="1"/>
       <w:sz w:val="20"/>
       <w:szCs w:val="20"/>
     </w:rPr>
@@ -1129,36 +1193,30 @@
     </w:pPr>
     <w:rPr>
       <w:b w:val="1"/>
+      <w:bCs w:val="1"/>
       <w:sz w:val="72"/>
       <w:szCs w:val="72"/>
     </w:rPr>
   </w:style>
-  <w:style w:type="paragraph" w:styleId="Normal">
-    <w:name w:val="Normal"/>
-    <w:next w:val="Normal"/>
-    <w:autoRedefine w:val="0"/>
-    <w:hidden w:val="0"/>
-    <w:qFormat w:val="0"/>
-    <w:pPr>
-      <w:suppressAutoHyphens w:val="1"/>
-      <w:spacing w:line="1" w:lineRule="atLeast"/>
-      <w:ind w:leftChars="-1" w:rightChars="0" w:firstLineChars="-1"/>
-      <w:textDirection w:val="btLr"/>
-      <w:textAlignment w:val="top"/>
-      <w:outlineLvl w:val="0"/>
-    </w:pPr>
-    <w:rPr>
-      <w:rFonts w:ascii="Times New Roman" w:eastAsia="Times New Roman" w:hAnsi="Times New Roman"/>
-      <w:w w:val="100"/>
-      <w:position w:val="-1"/>
-      <w:sz w:val="24"/>
-      <w:szCs w:val="24"/>
-      <w:effect w:val="none"/>
-      <w:vertAlign w:val="baseline"/>
-      <w:cs w:val="0"/>
-      <w:em w:val="none"/>
-      <w:lang w:bidi="ar-SA" w:eastAsia="fr-FR" w:val="fr-FR"/>
-    </w:rPr>
+  <w:style w:type="table" w:styleId="TableNormal" w:default="1">
+    <w:name w:val="TableNormal"/>
+    <w:tblPr>
+      <w:tblCellMar>
+        <w:top w:w="100.0" w:type="dxa"/>
+        <w:left w:w="100.0" w:type="dxa"/>
+        <w:bottom w:w="100.0" w:type="dxa"/>
+        <w:right w:w="100.0" w:type="dxa"/>
+      </w:tblCellMar>
+    </w:tblPr>
+  </w:style>
+  <w:style w:type="paragraph" w:styleId="Normal" w:default="1">
+    <w:name w:val="normal"/>
+  </w:style>
+  <w:style w:type="paragraph" w:styleId="Normal" w:default="1">
+    <w:name w:val="normal"/>
+  </w:style>
+  <w:style w:type="table" w:styleId="TableNormal" w:default="1">
+    <w:name w:val="Table Normal"/>
   </w:style>
   <w:style w:type="character" w:styleId="Policepardéfaut">
     <w:name w:val="Police par défaut"/>
@@ -1302,6 +1360,7 @@
     <w:rPr>
       <w:rFonts w:ascii="Georgia" w:cs="Georgia" w:eastAsia="Georgia" w:hAnsi="Georgia"/>
       <w:i w:val="1"/>
+      <w:iCs w:val="1"/>
       <w:color w:val="666666"/>
       <w:sz w:val="48"/>
       <w:szCs w:val="48"/>
@@ -1632,7 +1691,7 @@
 
 <file path=customXML/item1.xml><?xml version="1.0" encoding="utf-8"?>
 <go:gDocsCustomXmlDataStorage xmlns:go="http://customooxmlschemas.google.com/" xmlns:r="http://schemas.openxmlformats.org/officeDocument/2006/relationships" uri="GoogleDocsCustomDataVersion2">
-  <go:docsCustomData xmlns:go="http://customooxmlschemas.google.com/" roundtripDataSignature="AMtx7mis1VKSsOr7uI9A/kLFC08OLOyhFw==">CgMxLjA4AHIhMTJOVWN2a24zVGFrMG54UExFbFFMdnpnRzdzNjV4Y1I4</go:docsCustomData>
+  <go:docsCustomData xmlns:go="http://customooxmlschemas.google.com/" roundtripDataSignature="AMtx7mi8FuKzROTCty57JUUFbfT4Mnb8Kw==">CgMxLjA4AHIhMVZDNGJ4alJaT0JyczJ1bFRPM25McHZtb0NHdF8tQkoz</go:docsCustomData>
 </go:gDocsCustomXmlDataStorage>
 </file>
 

</xml_diff>